<commit_message>
Update UI & Logo & Art Assets
</commit_message>
<xml_diff>
--- a/LLM-tmp/01-策划案/《檐下千秋》游戏策划案.docx
+++ b/LLM-tmp/01-策划案/《檐下千秋》游戏策划案.docx
@@ -799,7 +799,7 @@
     </w:p>
     <w:p>
       <w:r>
-        <w:t>打开游戏后直接进入地图，不再注册、登录、输密码或领取登录令牌。配套 Go 程序仅负责本地游戏规则和 JSON 存档。新玩家建立固定本地进度；旧版存档首次使用时选择最近更新的一份玩家进度，其余旧记录完整保留。旧账号字段仅作原样兼容数据保留，不再参与任何认证。</w:t>
+        <w:t>打开游戏后先经过加载页与欢迎页，再选择关卡或继续旅程，不再注册、登录、输密码或领取登录令牌。配套 Go 程序仅负责本地游戏规则和 JSON 存档。新玩家建立固定本地进度；旧版存档首次使用时选择最近更新的一份玩家进度，其余旧记录完整保留。旧账号字段仅作原样兼容数据保留，不再参与任何认证。</w:t>
       </w:r>
     </w:p>
     <w:p>
@@ -875,12 +875,12 @@
     </w:p>
     <w:p>
       <w:r>
-        <w:t>目标受众为偏好文化叙事、轻解谜与收藏取舍的单人玩家。当前交付技术平台是 Windows x64；Godot 4.5.2 采用 540×960 逻辑竖屏，默认窗口 450×800。窗口可调整，设置提供全屏切换；宽屏居中保留约 540 逻辑像素阅读区。移动端只有触控操作设计，尚未构建手机安装包。</w:t>
+        <w:t>目标受众为偏好文化叙事、轻解谜与收藏取舍的单人玩家。当前交付技术平台是 Windows x64；Godot 4.5.2 采用 1280×720 逻辑横屏，默认窗口 1280×720。窗口可调整，设置提供全屏切换；按横屏画布伸缩，宽屏扩展可用空间，最小窗口 960×540。移动端只有触控操作设计，尚未构建手机安装包。</w:t>
       </w:r>
     </w:p>
     <w:p>
       <w:r>
-        <w:t>鼠标点击菜单和调查点，拖动完成构件归位，按笔顺描摹拓印。WASD、方向键和画布摇杆用于场景移动及预警闪避。底部固定地图、心舍、账册、设置、剧情五个入口；战斗的准备、四种技艺及结算位于独立固定操作栏，滚动正文不会带走技能按钮。</w:t>
+        <w:t>鼠标点击菜单和调查点，拖动完成构件归位，按笔顺描摹拓印。WASD、方向键和画布摇杆用于场景移动及预警闪避。进入旅程后底部固定关卡、心舍、账册、设置、剧情五个入口；战斗的准备、四种技艺及结算位于独立固定操作栏，滚动正文不会带走技能按钮。</w:t>
       </w:r>
     </w:p>
     <w:p>
@@ -2194,7 +2194,7 @@
     </w:p>
     <w:p>
       <w:r>
-        <w:t>顶栏显示作品名、心舍容量、墨痕、侵蚀阶段和进度条；中间滚动区承载任务正文与场景；底部常驻五个导航按钮。战斗在正文与导航之间增加准备按钮和两列技艺栏，进入心舍后隐藏，返回恢复原战斗。</w:t>
+        <w:t>顶栏显示作品名、心舍容量、墨痕、侵蚀阶段和进度条；中间以左侧画布与右侧独立滚动说明承载调查、修复和战斗；底部常驻五个导航按钮。战斗在正文与导航之间增加准备按钮和五列横向技艺栏，进入心舍后隐藏，返回恢复原战斗。</w:t>
       </w:r>
     </w:p>
     <w:p>
@@ -2241,6 +2241,84 @@
     <w:p>
       <w:r>
         <w:t>v8/v9 验收见同日《调试修复记录》《对话与失败演出实现》。正式材料及旧包冻结，队伍信息、命名、PDF 与视频留待正式整理。</w:t>
+      </w:r>
+    </w:p>
+    <w:p>
+      <w:pPr>
+        <w:pageBreakBefore/>
+      </w:pPr>
+      <w:r>
+        <w:rPr>
+          <w:b/>
+          <w:sz w:val="32"/>
+        </w:rPr>
+        <w:t>横屏入口与素材更新 2026年9月28日</w:t>
+      </w:r>
+    </w:p>
+    <w:p>
+      <w:pPr>
+        <w:spacing w:line="360" w:lineRule="auto"/>
+      </w:pPr>
+      <w:r>
+        <w:rPr>
+          <w:sz w:val="24"/>
+        </w:rPr>
+        <w:t>本轮保留内容协议 v10、五章十任务和服务端权威存档，重新设计横屏入口与游戏内布局。启动顺序为“加载 → 欢迎 → 关卡选择 → 开场对话 → 调查 → 修复 → 取舍 → 守护／结算”。欢迎页不显示游戏内资源栏或导航。</w:t>
+      </w:r>
+    </w:p>
+    <w:p>
+      <w:pPr>
+        <w:spacing w:line="360" w:lineRule="auto"/>
+      </w:pPr>
+      <w:r>
+        <w:rPr>
+          <w:sz w:val="24"/>
+        </w:rPr>
+        <w:t>加载页使用独立 Logo，按连接服务、读取旅程、展开章节、恢复会话显示真实阶段进度。只有全部步骤成功才进入欢迎页；失败显示原因、重新加载与退出，不建立虚假的离线进度。欢迎背景自带题字，操作集中于右下方，提供启程或继续旅程、选择关卡、声音设置和退出。</w:t>
+      </w:r>
+    </w:p>
+    <w:p>
+      <w:pPr>
+        <w:spacing w:line="360" w:lineRule="auto"/>
+      </w:pPr>
+      <w:r>
+        <w:rPr>
+          <w:sz w:val="24"/>
+        </w:rPr>
+        <w:t>关卡页上方横排五章，依次为廊桥、社庙、戏楼、牌坊、墨塔；章节按钮显示修复数量或未解锁状态，选中章节用暖金边框强调。下方左侧展示章节场景，右侧仅展示该章任务与解锁原因，避免十任务长列表。可预览锁定章节，但任务按钮不可进入；已修复任务标注重访；存在未完事件时显示继续入口。返回时保留所选章节。</w:t>
+      </w:r>
+    </w:p>
+    <w:p>
+      <w:pPr>
+        <w:spacing w:line="360" w:lineRule="auto"/>
+      </w:pPr>
+      <w:r>
+        <w:rPr>
+          <w:sz w:val="24"/>
+        </w:rPr>
+        <w:t>调查、描摹、构件修复、技艺机关和战斗采用左侧宽画布、右侧可滚动说明；图式选择保持横向并列。技能栏在底部横排，滚动说明不带走技能按钮。对话采用全幅背景与底部横向台词板。收藏、账册和结算长内容保持可滚动。窗口支持 960×540、1280×720、1600×900 与宽屏扩展。</w:t>
+      </w:r>
+    </w:p>
+    <w:p>
+      <w:pPr>
+        <w:spacing w:line="360" w:lineRule="auto"/>
+      </w:pPr>
+      <w:r>
+        <w:rPr>
+          <w:sz w:val="24"/>
+        </w:rPr>
+        <w:t>素材来源为 Task02/Original-new/生成图片：游戏开始界面、关卡选择界面背景、独立 Logo，以及十任务场景与飞鸟山共十一张横屏场景。运行时副本集中于客户端 assets/landscape；欢迎背景中的主角使用新版原画，游戏内可移动角色仍为墨色剪影。Logo 原图为带浅色棋盘底的 RGB 图片，界面以着色器去除浅底显示墨字，保留源文件。场景侵蚀仍由褪色与裂纹叠层表现。</w:t>
+      </w:r>
+    </w:p>
+    <w:p>
+      <w:pPr>
+        <w:spacing w:line="360" w:lineRule="auto"/>
+      </w:pPr>
+      <w:r>
+        <w:rPr>
+          <w:sz w:val="24"/>
+        </w:rPr>
+        <w:t>继续旅程优先恢复当前事件；首次启程进入关卡页。返回欢迎不清档、不新建玩家，不改变章节解锁、任务顺序、记忆取舍或战斗结算规则。未开始修复的调查在本次运行内暂停保留；关闭程序后，未提交的调查线索需要重新发现，已提交的会话按服务端进度恢复。</w:t>
       </w:r>
     </w:p>
     <w:sectPr>

</xml_diff>